<commit_message>
Venue and street pages base development done
</commit_message>
<xml_diff>
--- a/info/Specs.docx
+++ b/info/Specs.docx
@@ -47,19 +47,7 @@
           <w:rPr>
             <w:rStyle w:val="Hyperlink"/>
           </w:rPr>
-          <w:t>tim</w:t>
-        </w:r>
-        <w:r>
-          <w:rPr>
-            <w:rStyle w:val="Hyperlink"/>
-          </w:rPr>
-          <w:t>b</w:t>
-        </w:r>
-        <w:r>
-          <w:rPr>
-            <w:rStyle w:val="Hyperlink"/>
-          </w:rPr>
-          <w:t>re</w:t>
+          <w:t>timbre</w:t>
         </w:r>
       </w:hyperlink>
     </w:p>
@@ -123,7 +111,19 @@
         <w:rPr>
           <w:color w:val="57534E"/>
         </w:rPr>
-        <w:t>Timbre is a gamified music discovery world. The premise is simple: music has always lived somewhere. Jazz lived in dimly lit New York clubs. Grunge lived in Seattle basements. Hyperpop lives in fluorescent-lit bedrooms at 2am. Streaming apps give you the song. Timbre gives you the place.</w:t>
+        <w:t xml:space="preserve">Timbre is a </w:t>
+      </w:r>
+      <w:r>
+        <w:rPr>
+          <w:color w:val="57534E"/>
+        </w:rPr>
+        <w:t>M</w:t>
+      </w:r>
+      <w:r>
+        <w:rPr>
+          <w:color w:val="57534E"/>
+        </w:rPr>
+        <w:t>usic discovery world. The premise is simple: music has always lived somewhere. Jazz lived in dimly lit New York clubs. Grunge lived in Seattle basements. Hyperpop lives in fluorescent-lit bedrooms at 2am. Streaming apps give you the song. Timbre gives you the place.</w:t>
       </w:r>
     </w:p>
     <w:p>
@@ -134,7 +134,13 @@
         <w:rPr>
           <w:color w:val="57534E"/>
         </w:rPr>
-        <w:t>The user does not search for a song. They travel to an era, walk into a genre venue, and discover music the way it was meant to be heard</w:t>
+        <w:t>Timbre lets you</w:t>
+      </w:r>
+      <w:r>
+        <w:rPr>
+          <w:color w:val="57534E"/>
+        </w:rPr>
+        <w:t xml:space="preserve"> travel to an era, walk into a genre venue, and discover music the way it was meant to be heard</w:t>
       </w:r>
       <w:r>
         <w:rPr>
@@ -152,25 +158,25 @@
         <w:rPr>
           <w:color w:val="57534E"/>
         </w:rPr>
-        <w:t>-</w:t>
-      </w:r>
-      <w:r>
-        <w:rPr>
-          <w:color w:val="57534E"/>
-        </w:rPr>
-        <w:t xml:space="preserve"> the architecture, the lighting, the textures, the typography</w:t>
-      </w:r>
-      <w:r>
-        <w:rPr>
-          <w:color w:val="57534E"/>
-        </w:rPr>
-        <w:t>-</w:t>
-      </w:r>
-      <w:r>
-        <w:rPr>
-          <w:color w:val="57534E"/>
-        </w:rPr>
-        <w:t xml:space="preserve"> shifts to match the era and genre they are inside. Nothing is a stock photo. Every scene is built entirely in CSS.</w:t>
+        <w:t xml:space="preserve"> </w:t>
+      </w:r>
+      <w:r>
+        <w:rPr>
+          <w:color w:val="57534E"/>
+        </w:rPr>
+        <w:t xml:space="preserve">shifts to match the era and genre </w:t>
+      </w:r>
+      <w:r>
+        <w:rPr>
+          <w:color w:val="57534E"/>
+        </w:rPr>
+        <w:t>you</w:t>
+      </w:r>
+      <w:r>
+        <w:rPr>
+          <w:color w:val="57534E"/>
+        </w:rPr>
+        <w:t xml:space="preserve"> are inside.</w:t>
       </w:r>
     </w:p>
     <w:p>
@@ -181,7 +187,31 @@
         <w:rPr>
           <w:color w:val="57534E"/>
         </w:rPr>
-        <w:t>When a song moves them, they record it as a Memory</w:t>
+        <w:t xml:space="preserve">When a song moves </w:t>
+      </w:r>
+      <w:r>
+        <w:rPr>
+          <w:color w:val="57534E"/>
+        </w:rPr>
+        <w:t>you</w:t>
+      </w:r>
+      <w:r>
+        <w:rPr>
+          <w:color w:val="57534E"/>
+        </w:rPr>
+        <w:t xml:space="preserve">, </w:t>
+      </w:r>
+      <w:r>
+        <w:rPr>
+          <w:color w:val="57534E"/>
+        </w:rPr>
+        <w:t>you can</w:t>
+      </w:r>
+      <w:r>
+        <w:rPr>
+          <w:color w:val="57534E"/>
+        </w:rPr>
+        <w:t xml:space="preserve"> record it as a Memory</w:t>
       </w:r>
       <w:r>
         <w:rPr>
@@ -193,7 +223,57 @@
         <w:rPr>
           <w:color w:val="57534E"/>
         </w:rPr>
-        <w:t xml:space="preserve"> a card that stamps not just the song, but exactly where and when in the world they found it. Their collection of Memories is not a playlist. It is a record of everywhere they have been.</w:t>
+        <w:t xml:space="preserve"> a card that stamps not just the song, but exactly where and when in the world they found it. </w:t>
+      </w:r>
+      <w:r>
+        <w:rPr>
+          <w:color w:val="57534E"/>
+        </w:rPr>
+        <w:t>Your</w:t>
+      </w:r>
+      <w:r>
+        <w:rPr>
+          <w:color w:val="57534E"/>
+        </w:rPr>
+        <w:t xml:space="preserve"> collection of Memories is not a </w:t>
+      </w:r>
+      <w:proofErr w:type="gramStart"/>
+      <w:r>
+        <w:rPr>
+          <w:color w:val="57534E"/>
+        </w:rPr>
+        <w:t>playlist</w:t>
+      </w:r>
+      <w:r>
+        <w:rPr>
+          <w:color w:val="57534E"/>
+        </w:rPr>
+        <w:t>,</w:t>
+      </w:r>
+      <w:proofErr w:type="gramEnd"/>
+      <w:r>
+        <w:rPr>
+          <w:color w:val="57534E"/>
+        </w:rPr>
+        <w:t xml:space="preserve"> i</w:t>
+      </w:r>
+      <w:r>
+        <w:rPr>
+          <w:color w:val="57534E"/>
+        </w:rPr>
+        <w:t xml:space="preserve">t is a record of everywhere </w:t>
+      </w:r>
+      <w:r>
+        <w:rPr>
+          <w:color w:val="57534E"/>
+        </w:rPr>
+        <w:t>you</w:t>
+      </w:r>
+      <w:r>
+        <w:rPr>
+          <w:color w:val="57534E"/>
+        </w:rPr>
+        <w:t xml:space="preserve"> have been.</w:t>
       </w:r>
     </w:p>
     <w:p/>
@@ -250,6 +330,7 @@
         <w:pStyle w:val="Heading2"/>
       </w:pPr>
       <w:r>
+        <w:lastRenderedPageBreak/>
         <w:t>Era 1 — The 1970s</w:t>
       </w:r>
     </w:p>

</xml_diff>